<commit_message>
Finalize submission compliance and feedback export
</commit_message>
<xml_diff>
--- a/docs/deliverables/ITPM_Agile_Evidence_Addendum.docx
+++ b/docs/deliverables/ITPM_Agile_Evidence_Addendum.docx
@@ -1321,7 +1321,7 @@
           <w:b w:val="0"/>
           <w:sz w:val="21"/>
         </w:rPr>
-        <w:t>در Sprint 5 فرم بازخورد داخل MVP اضافه شد. هدف تا ارائه نهایی دریافت حداقل 5 بازخورد واقعی است.</w:t>
+        <w:t>در Sprint 5 فرم بازخورد داخل MVP اضافه شد. هدف تا ارائه نهایی دریافت حداقل 5 بازخورد واقعی است. بازخوردها علاوه بر fallback مرورگر، از طریق backend نیز در CSV سروری ذخیره و export می‌شوند.</w:t>
       </w:r>
     </w:p>
     <w:tbl>
@@ -1572,6 +1572,180 @@
                 <w:sz w:val="18"/>
               </w:rPr>
               <w:t>بررسی ارزش در شرایط ازدحام و بحران</w:t>
+            </w:r>
+          </w:p>
+        </w:tc>
+      </w:tr>
+    </w:tbl>
+    <w:p/>
+    <w:tbl>
+      <w:tblPr>
+        <w:tblStyle w:val="TableGrid"/>
+        <w:tblW w:type="auto" w:w="0"/>
+        <w:tblLook w:firstColumn="1" w:firstRow="1" w:lastColumn="0" w:lastRow="0" w:noHBand="0" w:noVBand="1" w:val="04A0"/>
+      </w:tblPr>
+      <w:tblGrid>
+        <w:gridCol w:w="5100"/>
+        <w:gridCol w:w="5100"/>
+      </w:tblGrid>
+      <w:tr>
+        <w:tc>
+          <w:tcPr>
+            <w:tcW w:type="dxa" w:w="5100"/>
+          </w:tcPr>
+          <w:p>
+            <w:pPr>
+              <w:jc w:val="right"/>
+              <w:bidi/>
+            </w:pPr>
+            <w:r>
+              <w:rPr>
+                <w:rFonts w:ascii="Tahoma" w:hAnsi="Tahoma" w:cs="Tahoma" w:eastAsia="Tahoma"/>
+                <w:b/>
+                <w:color w:val="0B2545"/>
+                <w:sz w:val="19"/>
+              </w:rPr>
+              <w:t>Endpoint</w:t>
+            </w:r>
+          </w:p>
+        </w:tc>
+        <w:tc>
+          <w:tcPr>
+            <w:tcW w:type="dxa" w:w="5100"/>
+          </w:tcPr>
+          <w:p>
+            <w:pPr>
+              <w:jc w:val="right"/>
+              <w:bidi/>
+            </w:pPr>
+            <w:r>
+              <w:rPr>
+                <w:rFonts w:ascii="Tahoma" w:hAnsi="Tahoma" w:cs="Tahoma" w:eastAsia="Tahoma"/>
+                <w:b/>
+                <w:color w:val="0B2545"/>
+                <w:sz w:val="19"/>
+              </w:rPr>
+              <w:t>هدف</w:t>
+            </w:r>
+          </w:p>
+        </w:tc>
+      </w:tr>
+      <w:tr>
+        <w:tc>
+          <w:tcPr>
+            <w:tcW w:type="dxa" w:w="5100"/>
+          </w:tcPr>
+          <w:p>
+            <w:pPr>
+              <w:jc w:val="right"/>
+              <w:bidi/>
+            </w:pPr>
+            <w:r>
+              <w:rPr>
+                <w:rFonts w:ascii="Tahoma" w:hAnsi="Tahoma" w:cs="Tahoma" w:eastAsia="Tahoma"/>
+                <w:b w:val="0"/>
+                <w:sz w:val="18"/>
+              </w:rPr>
+              <w:t>POST /feedback</w:t>
+            </w:r>
+          </w:p>
+        </w:tc>
+        <w:tc>
+          <w:tcPr>
+            <w:tcW w:type="dxa" w:w="5100"/>
+          </w:tcPr>
+          <w:p>
+            <w:pPr>
+              <w:jc w:val="right"/>
+              <w:bidi/>
+            </w:pPr>
+            <w:r>
+              <w:rPr>
+                <w:rFonts w:ascii="Tahoma" w:hAnsi="Tahoma" w:cs="Tahoma" w:eastAsia="Tahoma"/>
+                <w:b w:val="0"/>
+                <w:sz w:val="18"/>
+              </w:rPr>
+              <w:t>ثبت بازخورد ذی‌نفع</w:t>
+            </w:r>
+          </w:p>
+        </w:tc>
+      </w:tr>
+      <w:tr>
+        <w:tc>
+          <w:tcPr>
+            <w:tcW w:type="dxa" w:w="5100"/>
+          </w:tcPr>
+          <w:p>
+            <w:pPr>
+              <w:jc w:val="right"/>
+              <w:bidi/>
+            </w:pPr>
+            <w:r>
+              <w:rPr>
+                <w:rFonts w:ascii="Tahoma" w:hAnsi="Tahoma" w:cs="Tahoma" w:eastAsia="Tahoma"/>
+                <w:b w:val="0"/>
+                <w:sz w:val="18"/>
+              </w:rPr>
+              <w:t>GET /feedback-summary</w:t>
+            </w:r>
+          </w:p>
+        </w:tc>
+        <w:tc>
+          <w:tcPr>
+            <w:tcW w:type="dxa" w:w="5100"/>
+          </w:tcPr>
+          <w:p>
+            <w:pPr>
+              <w:jc w:val="right"/>
+              <w:bidi/>
+            </w:pPr>
+            <w:r>
+              <w:rPr>
+                <w:rFonts w:ascii="Tahoma" w:hAnsi="Tahoma" w:cs="Tahoma" w:eastAsia="Tahoma"/>
+                <w:b w:val="0"/>
+                <w:sz w:val="18"/>
+              </w:rPr>
+              <w:t>نمایش تعداد بازخوردهای ثبت‌شده</w:t>
+            </w:r>
+          </w:p>
+        </w:tc>
+      </w:tr>
+      <w:tr>
+        <w:tc>
+          <w:tcPr>
+            <w:tcW w:type="dxa" w:w="5100"/>
+          </w:tcPr>
+          <w:p>
+            <w:pPr>
+              <w:jc w:val="right"/>
+              <w:bidi/>
+            </w:pPr>
+            <w:r>
+              <w:rPr>
+                <w:rFonts w:ascii="Tahoma" w:hAnsi="Tahoma" w:cs="Tahoma" w:eastAsia="Tahoma"/>
+                <w:b w:val="0"/>
+                <w:sz w:val="18"/>
+              </w:rPr>
+              <w:t>GET /feedback/export</w:t>
+            </w:r>
+          </w:p>
+        </w:tc>
+        <w:tc>
+          <w:tcPr>
+            <w:tcW w:type="dxa" w:w="5100"/>
+          </w:tcPr>
+          <w:p>
+            <w:pPr>
+              <w:jc w:val="right"/>
+              <w:bidi/>
+            </w:pPr>
+            <w:r>
+              <w:rPr>
+                <w:rFonts w:ascii="Tahoma" w:hAnsi="Tahoma" w:cs="Tahoma" w:eastAsia="Tahoma"/>
+                <w:b w:val="0"/>
+                <w:sz w:val="18"/>
+              </w:rPr>
+              <w:t>خروجی CSV برای گزارش نهایی</w:t>
             </w:r>
           </w:p>
         </w:tc>

</xml_diff>